<commit_message>
Screenplay final draft and the lists
</commit_message>
<xml_diff>
--- a/The_A_Shorts/2. Vyuthi/Vyuthi - The Lists/Vyuthi - The SFX List.docx
+++ b/The_A_Shorts/2. Vyuthi/Vyuthi - The Lists/Vyuthi - The SFX List.docx
@@ -1796,27 +1796,7 @@
           <w:sz w:val="22"/>
           <w:szCs w:val="22"/>
         </w:rPr>
-        <w:t xml:space="preserve">Seizure to </w:t>
-      </w:r>
-      <w:r>
-        <w:rPr>
-          <w:rFonts w:ascii="Courier New" w:hAnsi="Courier New" w:cs="Courier New"/>
-          <w:b/>
-          <w:bCs/>
-          <w:sz w:val="22"/>
-          <w:szCs w:val="22"/>
-        </w:rPr>
-        <w:t>Shoelace</w:t>
-      </w:r>
-      <w:r>
-        <w:rPr>
-          <w:rFonts w:ascii="Courier New" w:hAnsi="Courier New" w:cs="Courier New"/>
-          <w:b/>
-          <w:bCs/>
-          <w:sz w:val="22"/>
-          <w:szCs w:val="22"/>
-        </w:rPr>
-        <w:t xml:space="preserve"> match cut – [21]</w:t>
+        <w:t>Seizure to Shoelace match cut – [21]</w:t>
       </w:r>
     </w:p>
     <w:p>
@@ -2625,26 +2605,149 @@
           <w:szCs w:val="22"/>
         </w:rPr>
       </w:pPr>
-    </w:p>
-    <w:p>
-      <w:pPr>
-        <w:rPr>
-          <w:rFonts w:ascii="Courier New" w:hAnsi="Courier New" w:cs="Courier New"/>
-          <w:b/>
-          <w:bCs/>
-          <w:sz w:val="22"/>
-          <w:szCs w:val="22"/>
-        </w:rPr>
-      </w:pPr>
-      <w:r>
-        <w:rPr>
-          <w:rFonts w:ascii="Courier New" w:hAnsi="Courier New" w:cs="Courier New"/>
-          <w:b/>
-          <w:bCs/>
-          <w:sz w:val="22"/>
-          <w:szCs w:val="22"/>
-        </w:rPr>
-        <w:t>Pan out of TV – [2</w:t>
+      <w:r>
+        <w:rPr>
+          <w:rFonts w:ascii="Courier New" w:hAnsi="Courier New" w:cs="Courier New"/>
+          <w:b/>
+          <w:bCs/>
+          <w:sz w:val="22"/>
+          <w:szCs w:val="22"/>
+        </w:rPr>
+        <w:t>Kriti and Ved disappear and Card lands from air – [26]</w:t>
+      </w:r>
+    </w:p>
+    <w:p>
+      <w:pPr>
+        <w:rPr>
+          <w:rFonts w:ascii="Courier New" w:hAnsi="Courier New" w:cs="Courier New"/>
+          <w:b/>
+          <w:bCs/>
+          <w:sz w:val="22"/>
+          <w:szCs w:val="22"/>
+        </w:rPr>
+      </w:pPr>
+      <w:r>
+        <w:rPr>
+          <w:rFonts w:ascii="Courier New" w:hAnsi="Courier New" w:cs="Courier New"/>
+          <w:b/>
+          <w:bCs/>
+          <w:sz w:val="22"/>
+          <w:szCs w:val="22"/>
+        </w:rPr>
+        <w:t>Kriti and Ved morph – [26]</w:t>
+      </w:r>
+    </w:p>
+    <w:p>
+      <w:pPr>
+        <w:rPr>
+          <w:rFonts w:ascii="Courier New" w:hAnsi="Courier New" w:cs="Courier New"/>
+          <w:b/>
+          <w:bCs/>
+          <w:sz w:val="22"/>
+          <w:szCs w:val="22"/>
+        </w:rPr>
+      </w:pPr>
+      <w:r>
+        <w:rPr>
+          <w:rFonts w:ascii="Courier New" w:hAnsi="Courier New" w:cs="Courier New"/>
+          <w:b/>
+          <w:bCs/>
+          <w:sz w:val="22"/>
+          <w:szCs w:val="22"/>
+        </w:rPr>
+        <w:t>Fog rolls in – [2</w:t>
+      </w:r>
+      <w:r>
+        <w:rPr>
+          <w:rFonts w:ascii="Courier New" w:hAnsi="Courier New" w:cs="Courier New"/>
+          <w:b/>
+          <w:bCs/>
+          <w:sz w:val="22"/>
+          <w:szCs w:val="22"/>
+        </w:rPr>
+        <w:t>7</w:t>
+      </w:r>
+      <w:r>
+        <w:rPr>
+          <w:rFonts w:ascii="Courier New" w:hAnsi="Courier New" w:cs="Courier New"/>
+          <w:b/>
+          <w:bCs/>
+          <w:sz w:val="22"/>
+          <w:szCs w:val="22"/>
+        </w:rPr>
+        <w:t>]</w:t>
+      </w:r>
+    </w:p>
+    <w:p>
+      <w:pPr>
+        <w:rPr>
+          <w:rFonts w:ascii="Courier New" w:hAnsi="Courier New" w:cs="Courier New"/>
+          <w:b/>
+          <w:bCs/>
+          <w:sz w:val="22"/>
+          <w:szCs w:val="22"/>
+        </w:rPr>
+      </w:pPr>
+      <w:r>
+        <w:rPr>
+          <w:rFonts w:ascii="Courier New" w:hAnsi="Courier New" w:cs="Courier New"/>
+          <w:b/>
+          <w:bCs/>
+          <w:sz w:val="22"/>
+          <w:szCs w:val="22"/>
+        </w:rPr>
+        <w:t>A glowing door – [2</w:t>
+      </w:r>
+      <w:r>
+        <w:rPr>
+          <w:rFonts w:ascii="Courier New" w:hAnsi="Courier New" w:cs="Courier New"/>
+          <w:b/>
+          <w:bCs/>
+          <w:sz w:val="22"/>
+          <w:szCs w:val="22"/>
+        </w:rPr>
+        <w:t>7</w:t>
+      </w:r>
+      <w:r>
+        <w:rPr>
+          <w:rFonts w:ascii="Courier New" w:hAnsi="Courier New" w:cs="Courier New"/>
+          <w:b/>
+          <w:bCs/>
+          <w:sz w:val="22"/>
+          <w:szCs w:val="22"/>
+        </w:rPr>
+        <w:t>]</w:t>
+      </w:r>
+    </w:p>
+    <w:p>
+      <w:pPr>
+        <w:rPr>
+          <w:rFonts w:ascii="Courier New" w:hAnsi="Courier New" w:cs="Courier New"/>
+          <w:b/>
+          <w:bCs/>
+          <w:sz w:val="22"/>
+          <w:szCs w:val="22"/>
+        </w:rPr>
+      </w:pPr>
+      <w:r>
+        <w:rPr>
+          <w:rFonts w:ascii="Courier New" w:hAnsi="Courier New" w:cs="Courier New"/>
+          <w:b/>
+          <w:bCs/>
+          <w:sz w:val="22"/>
+          <w:szCs w:val="22"/>
+        </w:rPr>
+        <w:t>Priest and Pyre</w:t>
+      </w:r>
+      <w:r>
+        <w:rPr>
+          <w:rFonts w:ascii="Courier New" w:hAnsi="Courier New" w:cs="Courier New"/>
+          <w:b/>
+          <w:bCs/>
+          <w:sz w:val="22"/>
+          <w:szCs w:val="22"/>
+        </w:rPr>
+        <w:t xml:space="preserve"> and Roaring flames – [</w:t>
       </w:r>
       <w:r>
         <w:rPr>
@@ -2664,6 +2767,16 @@
           <w:sz w:val="22"/>
           <w:szCs w:val="22"/>
         </w:rPr>
+        <w:t>7</w:t>
+      </w:r>
+      <w:r>
+        <w:rPr>
+          <w:rFonts w:ascii="Courier New" w:hAnsi="Courier New" w:cs="Courier New"/>
+          <w:b/>
+          <w:bCs/>
+          <w:sz w:val="22"/>
+          <w:szCs w:val="22"/>
+        </w:rPr>
         <w:t>]</w:t>
       </w:r>
     </w:p>
@@ -2685,17 +2798,17 @@
           <w:sz w:val="22"/>
           <w:szCs w:val="22"/>
         </w:rPr>
-        <w:t>Radio Static in TV – [2</w:t>
-      </w:r>
-      <w:r>
-        <w:rPr>
-          <w:rFonts w:ascii="Courier New" w:hAnsi="Courier New" w:cs="Courier New"/>
-          <w:b/>
-          <w:bCs/>
-          <w:sz w:val="22"/>
-          <w:szCs w:val="22"/>
-        </w:rPr>
-        <w:t>2</w:t>
+        <w:t>Fire transition through eye – [2</w:t>
+      </w:r>
+      <w:r>
+        <w:rPr>
+          <w:rFonts w:ascii="Courier New" w:hAnsi="Courier New" w:cs="Courier New"/>
+          <w:b/>
+          <w:bCs/>
+          <w:sz w:val="22"/>
+          <w:szCs w:val="22"/>
+        </w:rPr>
+        <w:t>7</w:t>
       </w:r>
       <w:r>
         <w:rPr>
@@ -2726,17 +2839,37 @@
           <w:sz w:val="22"/>
           <w:szCs w:val="22"/>
         </w:rPr>
-        <w:t>Water flows out of nowhere – [2</w:t>
-      </w:r>
-      <w:r>
-        <w:rPr>
-          <w:rFonts w:ascii="Courier New" w:hAnsi="Courier New" w:cs="Courier New"/>
-          <w:b/>
-          <w:bCs/>
-          <w:sz w:val="22"/>
-          <w:szCs w:val="22"/>
-        </w:rPr>
-        <w:t>2</w:t>
+        <w:t xml:space="preserve">The Red Field </w:t>
+      </w:r>
+      <w:r>
+        <w:rPr>
+          <w:rFonts w:ascii="Courier New" w:hAnsi="Courier New" w:cs="Courier New"/>
+          <w:b/>
+          <w:bCs/>
+          <w:sz w:val="22"/>
+          <w:szCs w:val="22"/>
+        </w:rPr>
+        <w:t xml:space="preserve">with clouds and thunder </w:t>
+      </w:r>
+      <w:r>
+        <w:rPr>
+          <w:rFonts w:ascii="Courier New" w:hAnsi="Courier New" w:cs="Courier New"/>
+          <w:b/>
+          <w:bCs/>
+          <w:sz w:val="22"/>
+          <w:szCs w:val="22"/>
+        </w:rPr>
+        <w:t>– [2</w:t>
+      </w:r>
+      <w:r>
+        <w:rPr>
+          <w:rFonts w:ascii="Courier New" w:hAnsi="Courier New" w:cs="Courier New"/>
+          <w:b/>
+          <w:bCs/>
+          <w:sz w:val="22"/>
+          <w:szCs w:val="22"/>
+        </w:rPr>
+        <w:t>8</w:t>
       </w:r>
       <w:r>
         <w:rPr>
@@ -2767,98 +2900,27 @@
           <w:sz w:val="22"/>
           <w:szCs w:val="22"/>
         </w:rPr>
-        <w:t xml:space="preserve">The Balloon </w:t>
-      </w:r>
-      <w:r>
-        <w:rPr>
-          <w:rFonts w:ascii="Courier New" w:hAnsi="Courier New" w:cs="Courier New"/>
-          <w:b/>
-          <w:bCs/>
-          <w:sz w:val="22"/>
-          <w:szCs w:val="22"/>
-        </w:rPr>
-        <w:t>flo</w:t>
-      </w:r>
-      <w:r>
-        <w:rPr>
-          <w:rFonts w:ascii="Courier New" w:hAnsi="Courier New" w:cs="Courier New"/>
-          <w:b/>
-          <w:bCs/>
-          <w:sz w:val="22"/>
-          <w:szCs w:val="22"/>
-        </w:rPr>
-        <w:t xml:space="preserve">ats </w:t>
-      </w:r>
-      <w:r>
-        <w:rPr>
-          <w:rFonts w:ascii="Courier New" w:hAnsi="Courier New" w:cs="Courier New"/>
-          <w:b/>
-          <w:bCs/>
-          <w:sz w:val="22"/>
-          <w:szCs w:val="22"/>
-        </w:rPr>
-        <w:t>and p</w:t>
-      </w:r>
-      <w:r>
-        <w:rPr>
-          <w:rFonts w:ascii="Courier New" w:hAnsi="Courier New" w:cs="Courier New"/>
-          <w:b/>
-          <w:bCs/>
-          <w:sz w:val="22"/>
-          <w:szCs w:val="22"/>
-        </w:rPr>
-        <w:t xml:space="preserve">ops </w:t>
-      </w:r>
-      <w:r>
-        <w:rPr>
-          <w:rFonts w:ascii="Courier New" w:hAnsi="Courier New" w:cs="Courier New"/>
-          <w:b/>
-          <w:bCs/>
-          <w:sz w:val="22"/>
-          <w:szCs w:val="22"/>
-        </w:rPr>
-        <w:t>– [22]</w:t>
-      </w:r>
-    </w:p>
-    <w:p>
-      <w:pPr>
-        <w:rPr>
-          <w:rFonts w:ascii="Courier New" w:hAnsi="Courier New" w:cs="Courier New"/>
-          <w:b/>
-          <w:bCs/>
-          <w:sz w:val="22"/>
-          <w:szCs w:val="22"/>
-        </w:rPr>
-      </w:pPr>
-      <w:r>
-        <w:rPr>
-          <w:rFonts w:ascii="Courier New" w:hAnsi="Courier New" w:cs="Courier New"/>
-          <w:b/>
-          <w:bCs/>
-          <w:sz w:val="22"/>
-          <w:szCs w:val="22"/>
-        </w:rPr>
-        <w:t xml:space="preserve">Balloon flies and </w:t>
-      </w:r>
-      <w:r>
-        <w:rPr>
-          <w:rFonts w:ascii="Courier New" w:hAnsi="Courier New" w:cs="Courier New"/>
-          <w:b/>
-          <w:bCs/>
-          <w:sz w:val="22"/>
-          <w:szCs w:val="22"/>
-        </w:rPr>
-        <w:t>Ved turn demonic – [2</w:t>
-      </w:r>
-      <w:r>
-        <w:rPr>
-          <w:rFonts w:ascii="Courier New" w:hAnsi="Courier New" w:cs="Courier New"/>
-          <w:b/>
-          <w:bCs/>
-          <w:sz w:val="22"/>
-          <w:szCs w:val="22"/>
-        </w:rPr>
-        <w:t>2</w:t>
+        <w:t>The Flying</w:t>
+      </w:r>
+      <w:r>
+        <w:rPr>
+          <w:rFonts w:ascii="Courier New" w:hAnsi="Courier New" w:cs="Courier New"/>
+          <w:b/>
+          <w:bCs/>
+          <w:sz w:val="22"/>
+          <w:szCs w:val="22"/>
+        </w:rPr>
+        <w:t xml:space="preserve"> hands of the Ghosts – [2</w:t>
+      </w:r>
+      <w:r>
+        <w:rPr>
+          <w:rFonts w:ascii="Courier New" w:hAnsi="Courier New" w:cs="Courier New"/>
+          <w:b/>
+          <w:bCs/>
+          <w:sz w:val="22"/>
+          <w:szCs w:val="22"/>
+        </w:rPr>
+        <w:t>8</w:t>
       </w:r>
       <w:r>
         <w:rPr>
@@ -2889,48 +2951,428 @@
           <w:sz w:val="22"/>
           <w:szCs w:val="22"/>
         </w:rPr>
-        <w:t>Door closes behind Ved – [2</w:t>
-      </w:r>
-      <w:r>
-        <w:rPr>
-          <w:rFonts w:ascii="Courier New" w:hAnsi="Courier New" w:cs="Courier New"/>
-          <w:b/>
-          <w:bCs/>
-          <w:sz w:val="22"/>
-          <w:szCs w:val="22"/>
-        </w:rPr>
-        <w:t>3]</w:t>
-      </w:r>
-    </w:p>
-    <w:p>
-      <w:pPr>
-        <w:rPr>
-          <w:rFonts w:ascii="Courier New" w:hAnsi="Courier New" w:cs="Courier New"/>
-          <w:b/>
-          <w:bCs/>
-          <w:sz w:val="22"/>
-          <w:szCs w:val="22"/>
-        </w:rPr>
-      </w:pPr>
-      <w:r>
-        <w:rPr>
-          <w:rFonts w:ascii="Courier New" w:hAnsi="Courier New" w:cs="Courier New"/>
-          <w:b/>
-          <w:bCs/>
-          <w:sz w:val="22"/>
-          <w:szCs w:val="22"/>
-        </w:rPr>
-        <w:t>Multiple locations through door</w:t>
-      </w:r>
-      <w:r>
-        <w:rPr>
-          <w:rFonts w:ascii="Courier New" w:hAnsi="Courier New" w:cs="Courier New"/>
-          <w:b/>
-          <w:bCs/>
-          <w:sz w:val="22"/>
-          <w:szCs w:val="22"/>
-        </w:rPr>
-        <w:t>s</w:t>
+        <w:t>Ghost hands grip his face – [2</w:t>
+      </w:r>
+      <w:r>
+        <w:rPr>
+          <w:rFonts w:ascii="Courier New" w:hAnsi="Courier New" w:cs="Courier New"/>
+          <w:b/>
+          <w:bCs/>
+          <w:sz w:val="22"/>
+          <w:szCs w:val="22"/>
+        </w:rPr>
+        <w:t>8</w:t>
+      </w:r>
+      <w:r>
+        <w:rPr>
+          <w:rFonts w:ascii="Courier New" w:hAnsi="Courier New" w:cs="Courier New"/>
+          <w:b/>
+          <w:bCs/>
+          <w:sz w:val="22"/>
+          <w:szCs w:val="22"/>
+        </w:rPr>
+        <w:t>]</w:t>
+      </w:r>
+    </w:p>
+    <w:p>
+      <w:pPr>
+        <w:rPr>
+          <w:rFonts w:ascii="Courier New" w:hAnsi="Courier New" w:cs="Courier New"/>
+          <w:b/>
+          <w:bCs/>
+          <w:sz w:val="22"/>
+          <w:szCs w:val="22"/>
+        </w:rPr>
+      </w:pPr>
+      <w:r>
+        <w:rPr>
+          <w:rFonts w:ascii="Courier New" w:hAnsi="Courier New" w:cs="Courier New"/>
+          <w:b/>
+          <w:bCs/>
+          <w:sz w:val="22"/>
+          <w:szCs w:val="22"/>
+        </w:rPr>
+        <w:t>The Red Sky with 2 Suns and Vortex – [2</w:t>
+      </w:r>
+      <w:r>
+        <w:rPr>
+          <w:rFonts w:ascii="Courier New" w:hAnsi="Courier New" w:cs="Courier New"/>
+          <w:b/>
+          <w:bCs/>
+          <w:sz w:val="22"/>
+          <w:szCs w:val="22"/>
+        </w:rPr>
+        <w:t>8</w:t>
+      </w:r>
+      <w:r>
+        <w:rPr>
+          <w:rFonts w:ascii="Courier New" w:hAnsi="Courier New" w:cs="Courier New"/>
+          <w:b/>
+          <w:bCs/>
+          <w:sz w:val="22"/>
+          <w:szCs w:val="22"/>
+        </w:rPr>
+        <w:t>]</w:t>
+      </w:r>
+    </w:p>
+    <w:p>
+      <w:pPr>
+        <w:rPr>
+          <w:rFonts w:ascii="Courier New" w:hAnsi="Courier New" w:cs="Courier New"/>
+          <w:b/>
+          <w:bCs/>
+          <w:sz w:val="22"/>
+          <w:szCs w:val="22"/>
+        </w:rPr>
+      </w:pPr>
+      <w:r>
+        <w:rPr>
+          <w:rFonts w:ascii="Courier New" w:hAnsi="Courier New" w:cs="Courier New"/>
+          <w:b/>
+          <w:bCs/>
+          <w:sz w:val="22"/>
+          <w:szCs w:val="22"/>
+        </w:rPr>
+        <w:t>Hit face to tree and fall – [2</w:t>
+      </w:r>
+      <w:r>
+        <w:rPr>
+          <w:rFonts w:ascii="Courier New" w:hAnsi="Courier New" w:cs="Courier New"/>
+          <w:b/>
+          <w:bCs/>
+          <w:sz w:val="22"/>
+          <w:szCs w:val="22"/>
+        </w:rPr>
+        <w:t>8</w:t>
+      </w:r>
+      <w:r>
+        <w:rPr>
+          <w:rFonts w:ascii="Courier New" w:hAnsi="Courier New" w:cs="Courier New"/>
+          <w:b/>
+          <w:bCs/>
+          <w:sz w:val="22"/>
+          <w:szCs w:val="22"/>
+        </w:rPr>
+        <w:t>]</w:t>
+      </w:r>
+    </w:p>
+    <w:p>
+      <w:pPr>
+        <w:rPr>
+          <w:rFonts w:ascii="Courier New" w:hAnsi="Courier New" w:cs="Courier New"/>
+          <w:b/>
+          <w:bCs/>
+          <w:sz w:val="22"/>
+          <w:szCs w:val="22"/>
+        </w:rPr>
+      </w:pPr>
+      <w:r>
+        <w:rPr>
+          <w:rFonts w:ascii="Courier New" w:hAnsi="Courier New" w:cs="Courier New"/>
+          <w:b/>
+          <w:bCs/>
+          <w:sz w:val="22"/>
+          <w:szCs w:val="22"/>
+        </w:rPr>
+        <w:t>Ghostly silhouettes</w:t>
+      </w:r>
+      <w:r>
+        <w:rPr>
+          <w:rFonts w:ascii="Courier New" w:hAnsi="Courier New" w:cs="Courier New"/>
+          <w:b/>
+          <w:bCs/>
+          <w:sz w:val="22"/>
+          <w:szCs w:val="22"/>
+        </w:rPr>
+        <w:t xml:space="preserve"> in the distance – [2</w:t>
+      </w:r>
+      <w:r>
+        <w:rPr>
+          <w:rFonts w:ascii="Courier New" w:hAnsi="Courier New" w:cs="Courier New"/>
+          <w:b/>
+          <w:bCs/>
+          <w:sz w:val="22"/>
+          <w:szCs w:val="22"/>
+        </w:rPr>
+        <w:t>8</w:t>
+      </w:r>
+      <w:r>
+        <w:rPr>
+          <w:rFonts w:ascii="Courier New" w:hAnsi="Courier New" w:cs="Courier New"/>
+          <w:b/>
+          <w:bCs/>
+          <w:sz w:val="22"/>
+          <w:szCs w:val="22"/>
+        </w:rPr>
+        <w:t>]</w:t>
+      </w:r>
+    </w:p>
+    <w:p>
+      <w:pPr>
+        <w:rPr>
+          <w:rFonts w:ascii="Courier New" w:hAnsi="Courier New" w:cs="Courier New"/>
+          <w:b/>
+          <w:bCs/>
+          <w:sz w:val="22"/>
+          <w:szCs w:val="22"/>
+        </w:rPr>
+      </w:pPr>
+      <w:r>
+        <w:rPr>
+          <w:rFonts w:ascii="Courier New" w:hAnsi="Courier New" w:cs="Courier New"/>
+          <w:b/>
+          <w:bCs/>
+          <w:sz w:val="22"/>
+          <w:szCs w:val="22"/>
+        </w:rPr>
+        <w:t>Appearance of Adi’s father’s ghost – [2</w:t>
+      </w:r>
+      <w:r>
+        <w:rPr>
+          <w:rFonts w:ascii="Courier New" w:hAnsi="Courier New" w:cs="Courier New"/>
+          <w:b/>
+          <w:bCs/>
+          <w:sz w:val="22"/>
+          <w:szCs w:val="22"/>
+        </w:rPr>
+        <w:t>8</w:t>
+      </w:r>
+      <w:r>
+        <w:rPr>
+          <w:rFonts w:ascii="Courier New" w:hAnsi="Courier New" w:cs="Courier New"/>
+          <w:b/>
+          <w:bCs/>
+          <w:sz w:val="22"/>
+          <w:szCs w:val="22"/>
+        </w:rPr>
+        <w:t>]</w:t>
+      </w:r>
+    </w:p>
+    <w:p>
+      <w:pPr>
+        <w:rPr>
+          <w:rFonts w:ascii="Courier New" w:hAnsi="Courier New" w:cs="Courier New"/>
+          <w:b/>
+          <w:bCs/>
+          <w:sz w:val="22"/>
+          <w:szCs w:val="22"/>
+        </w:rPr>
+      </w:pPr>
+      <w:r>
+        <w:rPr>
+          <w:rFonts w:ascii="Courier New" w:hAnsi="Courier New" w:cs="Courier New"/>
+          <w:b/>
+          <w:bCs/>
+          <w:sz w:val="22"/>
+          <w:szCs w:val="22"/>
+        </w:rPr>
+        <w:lastRenderedPageBreak/>
+        <w:t>Raven flies and sits on a tree – [28]</w:t>
+      </w:r>
+    </w:p>
+    <w:p>
+      <w:pPr>
+        <w:rPr>
+          <w:rFonts w:ascii="Courier New" w:hAnsi="Courier New" w:cs="Courier New"/>
+          <w:b/>
+          <w:bCs/>
+          <w:sz w:val="22"/>
+          <w:szCs w:val="22"/>
+        </w:rPr>
+      </w:pPr>
+      <w:r>
+        <w:rPr>
+          <w:rFonts w:ascii="Courier New" w:hAnsi="Courier New" w:cs="Courier New"/>
+          <w:b/>
+          <w:bCs/>
+          <w:sz w:val="22"/>
+          <w:szCs w:val="22"/>
+        </w:rPr>
+        <w:t>Sesame appears on his face – [2</w:t>
+      </w:r>
+      <w:r>
+        <w:rPr>
+          <w:rFonts w:ascii="Courier New" w:hAnsi="Courier New" w:cs="Courier New"/>
+          <w:b/>
+          <w:bCs/>
+          <w:sz w:val="22"/>
+          <w:szCs w:val="22"/>
+        </w:rPr>
+        <w:t>8</w:t>
+      </w:r>
+      <w:r>
+        <w:rPr>
+          <w:rFonts w:ascii="Courier New" w:hAnsi="Courier New" w:cs="Courier New"/>
+          <w:b/>
+          <w:bCs/>
+          <w:sz w:val="22"/>
+          <w:szCs w:val="22"/>
+        </w:rPr>
+        <w:t>]</w:t>
+      </w:r>
+    </w:p>
+    <w:p>
+      <w:pPr>
+        <w:rPr>
+          <w:rFonts w:ascii="Courier New" w:hAnsi="Courier New" w:cs="Courier New"/>
+          <w:b/>
+          <w:bCs/>
+          <w:sz w:val="22"/>
+          <w:szCs w:val="22"/>
+        </w:rPr>
+      </w:pPr>
+      <w:r>
+        <w:rPr>
+          <w:rFonts w:ascii="Courier New" w:hAnsi="Courier New" w:cs="Courier New"/>
+          <w:b/>
+          <w:bCs/>
+          <w:sz w:val="22"/>
+          <w:szCs w:val="22"/>
+        </w:rPr>
+        <w:t>Raven eats sesame – [2</w:t>
+      </w:r>
+      <w:r>
+        <w:rPr>
+          <w:rFonts w:ascii="Courier New" w:hAnsi="Courier New" w:cs="Courier New"/>
+          <w:b/>
+          <w:bCs/>
+          <w:sz w:val="22"/>
+          <w:szCs w:val="22"/>
+        </w:rPr>
+        <w:t>8</w:t>
+      </w:r>
+      <w:r>
+        <w:rPr>
+          <w:rFonts w:ascii="Courier New" w:hAnsi="Courier New" w:cs="Courier New"/>
+          <w:b/>
+          <w:bCs/>
+          <w:sz w:val="22"/>
+          <w:szCs w:val="22"/>
+        </w:rPr>
+        <w:t>]</w:t>
+      </w:r>
+    </w:p>
+    <w:p>
+      <w:pPr>
+        <w:rPr>
+          <w:rFonts w:ascii="Courier New" w:hAnsi="Courier New" w:cs="Courier New"/>
+          <w:b/>
+          <w:bCs/>
+          <w:sz w:val="22"/>
+          <w:szCs w:val="22"/>
+        </w:rPr>
+      </w:pPr>
+      <w:r>
+        <w:rPr>
+          <w:rFonts w:ascii="Courier New" w:hAnsi="Courier New" w:cs="Courier New"/>
+          <w:b/>
+          <w:bCs/>
+          <w:sz w:val="22"/>
+          <w:szCs w:val="22"/>
+        </w:rPr>
+        <w:t>Vasu shots – [2</w:t>
+      </w:r>
+      <w:r>
+        <w:rPr>
+          <w:rFonts w:ascii="Courier New" w:hAnsi="Courier New" w:cs="Courier New"/>
+          <w:b/>
+          <w:bCs/>
+          <w:sz w:val="22"/>
+          <w:szCs w:val="22"/>
+        </w:rPr>
+        <w:t>8</w:t>
+      </w:r>
+      <w:r>
+        <w:rPr>
+          <w:rFonts w:ascii="Courier New" w:hAnsi="Courier New" w:cs="Courier New"/>
+          <w:b/>
+          <w:bCs/>
+          <w:sz w:val="22"/>
+          <w:szCs w:val="22"/>
+        </w:rPr>
+        <w:t>]</w:t>
+      </w:r>
+    </w:p>
+    <w:p>
+      <w:pPr>
+        <w:rPr>
+          <w:rFonts w:ascii="Courier New" w:hAnsi="Courier New" w:cs="Courier New"/>
+          <w:b/>
+          <w:bCs/>
+          <w:sz w:val="22"/>
+          <w:szCs w:val="22"/>
+        </w:rPr>
+      </w:pPr>
+      <w:r>
+        <w:rPr>
+          <w:rFonts w:ascii="Courier New" w:hAnsi="Courier New" w:cs="Courier New"/>
+          <w:b/>
+          <w:bCs/>
+          <w:sz w:val="22"/>
+          <w:szCs w:val="22"/>
+        </w:rPr>
+        <w:t xml:space="preserve">The </w:t>
+      </w:r>
+      <w:r>
+        <w:rPr>
+          <w:rFonts w:ascii="Courier New" w:hAnsi="Courier New" w:cs="Courier New"/>
+          <w:b/>
+          <w:bCs/>
+          <w:sz w:val="22"/>
+          <w:szCs w:val="22"/>
+        </w:rPr>
+        <w:t>three P</w:t>
+      </w:r>
+      <w:r>
+        <w:rPr>
+          <w:rFonts w:ascii="Courier New" w:hAnsi="Courier New" w:cs="Courier New"/>
+          <w:b/>
+          <w:bCs/>
+          <w:sz w:val="22"/>
+          <w:szCs w:val="22"/>
+        </w:rPr>
+        <w:t>itrus – [2</w:t>
+      </w:r>
+      <w:r>
+        <w:rPr>
+          <w:rFonts w:ascii="Courier New" w:hAnsi="Courier New" w:cs="Courier New"/>
+          <w:b/>
+          <w:bCs/>
+          <w:sz w:val="22"/>
+          <w:szCs w:val="22"/>
+        </w:rPr>
+        <w:t>8</w:t>
+      </w:r>
+      <w:r>
+        <w:rPr>
+          <w:rFonts w:ascii="Courier New" w:hAnsi="Courier New" w:cs="Courier New"/>
+          <w:b/>
+          <w:bCs/>
+          <w:sz w:val="22"/>
+          <w:szCs w:val="22"/>
+        </w:rPr>
+        <w:t>]</w:t>
+      </w:r>
+    </w:p>
+    <w:p>
+      <w:pPr>
+        <w:rPr>
+          <w:rFonts w:ascii="Courier New" w:hAnsi="Courier New" w:cs="Courier New"/>
+          <w:b/>
+          <w:bCs/>
+          <w:sz w:val="22"/>
+          <w:szCs w:val="22"/>
+        </w:rPr>
+      </w:pPr>
+      <w:r>
+        <w:rPr>
+          <w:rFonts w:ascii="Courier New" w:hAnsi="Courier New" w:cs="Courier New"/>
+          <w:b/>
+          <w:bCs/>
+          <w:sz w:val="22"/>
+          <w:szCs w:val="22"/>
+        </w:rPr>
+        <w:t>Father opens a portal</w:t>
       </w:r>
       <w:r>
         <w:rPr>
@@ -2950,7 +3392,7 @@
           <w:sz w:val="22"/>
           <w:szCs w:val="22"/>
         </w:rPr>
-        <w:t>3</w:t>
+        <w:t>8</w:t>
       </w:r>
       <w:r>
         <w:rPr>
@@ -2981,17 +3423,17 @@
           <w:sz w:val="22"/>
           <w:szCs w:val="22"/>
         </w:rPr>
-        <w:t>Multiple door portal effect – [2</w:t>
-      </w:r>
-      <w:r>
-        <w:rPr>
-          <w:rFonts w:ascii="Courier New" w:hAnsi="Courier New" w:cs="Courier New"/>
-          <w:b/>
-          <w:bCs/>
-          <w:sz w:val="22"/>
-          <w:szCs w:val="22"/>
-        </w:rPr>
-        <w:t>3</w:t>
+        <w:t>Portal drifts away – [2</w:t>
+      </w:r>
+      <w:r>
+        <w:rPr>
+          <w:rFonts w:ascii="Courier New" w:hAnsi="Courier New" w:cs="Courier New"/>
+          <w:b/>
+          <w:bCs/>
+          <w:sz w:val="22"/>
+          <w:szCs w:val="22"/>
+        </w:rPr>
+        <w:t>9</w:t>
       </w:r>
       <w:r>
         <w:rPr>
@@ -3022,17 +3464,17 @@
           <w:sz w:val="22"/>
           <w:szCs w:val="22"/>
         </w:rPr>
-        <w:t>Floating old woman – [2</w:t>
-      </w:r>
-      <w:r>
-        <w:rPr>
-          <w:rFonts w:ascii="Courier New" w:hAnsi="Courier New" w:cs="Courier New"/>
-          <w:b/>
-          <w:bCs/>
-          <w:sz w:val="22"/>
-          <w:szCs w:val="22"/>
-        </w:rPr>
-        <w:t>3</w:t>
+        <w:t>Mirror Delay – [2</w:t>
+      </w:r>
+      <w:r>
+        <w:rPr>
+          <w:rFonts w:ascii="Courier New" w:hAnsi="Courier New" w:cs="Courier New"/>
+          <w:b/>
+          <w:bCs/>
+          <w:sz w:val="22"/>
+          <w:szCs w:val="22"/>
+        </w:rPr>
+        <w:t>9</w:t>
       </w:r>
       <w:r>
         <w:rPr>
@@ -3063,17 +3505,77 @@
           <w:sz w:val="22"/>
           <w:szCs w:val="22"/>
         </w:rPr>
-        <w:t>Adi and Ghost float as room rotates – [2</w:t>
-      </w:r>
-      <w:r>
-        <w:rPr>
-          <w:rFonts w:ascii="Courier New" w:hAnsi="Courier New" w:cs="Courier New"/>
-          <w:b/>
-          <w:bCs/>
-          <w:sz w:val="22"/>
-          <w:szCs w:val="22"/>
-        </w:rPr>
-        <w:t>3</w:t>
+        <w:t>Mirror explo</w:t>
+      </w:r>
+      <w:r>
+        <w:rPr>
+          <w:rFonts w:ascii="Courier New" w:hAnsi="Courier New" w:cs="Courier New"/>
+          <w:b/>
+          <w:bCs/>
+          <w:sz w:val="22"/>
+          <w:szCs w:val="22"/>
+        </w:rPr>
+        <w:t xml:space="preserve">sion and </w:t>
+      </w:r>
+      <w:r>
+        <w:rPr>
+          <w:rFonts w:ascii="Courier New" w:hAnsi="Courier New" w:cs="Courier New"/>
+          <w:b/>
+          <w:bCs/>
+          <w:sz w:val="22"/>
+          <w:szCs w:val="22"/>
+        </w:rPr>
+        <w:t xml:space="preserve">propelled </w:t>
+      </w:r>
+      <w:r>
+        <w:rPr>
+          <w:rFonts w:ascii="Courier New" w:hAnsi="Courier New" w:cs="Courier New"/>
+          <w:b/>
+          <w:bCs/>
+          <w:sz w:val="22"/>
+          <w:szCs w:val="22"/>
+        </w:rPr>
+        <w:t>back</w:t>
+      </w:r>
+      <w:r>
+        <w:rPr>
+          <w:rFonts w:ascii="Courier New" w:hAnsi="Courier New" w:cs="Courier New"/>
+          <w:b/>
+          <w:bCs/>
+          <w:sz w:val="22"/>
+          <w:szCs w:val="22"/>
+        </w:rPr>
+        <w:t>ward</w:t>
+      </w:r>
+      <w:r>
+        <w:rPr>
+          <w:rFonts w:ascii="Courier New" w:hAnsi="Courier New" w:cs="Courier New"/>
+          <w:b/>
+          <w:bCs/>
+          <w:sz w:val="22"/>
+          <w:szCs w:val="22"/>
+        </w:rPr>
+        <w:t xml:space="preserve"> </w:t>
+      </w:r>
+      <w:r>
+        <w:rPr>
+          <w:rFonts w:ascii="Courier New" w:hAnsi="Courier New" w:cs="Courier New"/>
+          <w:b/>
+          <w:bCs/>
+          <w:sz w:val="22"/>
+          <w:szCs w:val="22"/>
+        </w:rPr>
+        <w:t>– [2</w:t>
+      </w:r>
+      <w:r>
+        <w:rPr>
+          <w:rFonts w:ascii="Courier New" w:hAnsi="Courier New" w:cs="Courier New"/>
+          <w:b/>
+          <w:bCs/>
+          <w:sz w:val="22"/>
+          <w:szCs w:val="22"/>
+        </w:rPr>
+        <w:t>9</w:t>
       </w:r>
       <w:r>
         <w:rPr>
@@ -3104,17 +3606,37 @@
           <w:sz w:val="22"/>
           <w:szCs w:val="22"/>
         </w:rPr>
-        <w:t>Loop de loop eyes – [2</w:t>
-      </w:r>
-      <w:r>
-        <w:rPr>
-          <w:rFonts w:ascii="Courier New" w:hAnsi="Courier New" w:cs="Courier New"/>
-          <w:b/>
-          <w:bCs/>
-          <w:sz w:val="22"/>
-          <w:szCs w:val="22"/>
-        </w:rPr>
-        <w:t>3</w:t>
+        <w:t xml:space="preserve">The Memory </w:t>
+      </w:r>
+      <w:r>
+        <w:rPr>
+          <w:rFonts w:ascii="Courier New" w:hAnsi="Courier New" w:cs="Courier New"/>
+          <w:b/>
+          <w:bCs/>
+          <w:sz w:val="22"/>
+          <w:szCs w:val="22"/>
+        </w:rPr>
+        <w:t>shards m</w:t>
+      </w:r>
+      <w:r>
+        <w:rPr>
+          <w:rFonts w:ascii="Courier New" w:hAnsi="Courier New" w:cs="Courier New"/>
+          <w:b/>
+          <w:bCs/>
+          <w:sz w:val="22"/>
+          <w:szCs w:val="22"/>
+        </w:rPr>
+        <w:t>ontage – [2</w:t>
+      </w:r>
+      <w:r>
+        <w:rPr>
+          <w:rFonts w:ascii="Courier New" w:hAnsi="Courier New" w:cs="Courier New"/>
+          <w:b/>
+          <w:bCs/>
+          <w:sz w:val="22"/>
+          <w:szCs w:val="22"/>
+        </w:rPr>
+        <w:t>9</w:t>
       </w:r>
       <w:r>
         <w:rPr>
@@ -3129,129 +3651,115 @@
     </w:p>
     <w:p>
       <w:pPr>
-        <w:spacing w:line="240" w:lineRule="auto"/>
-        <w:rPr>
-          <w:rFonts w:ascii="Courier New" w:hAnsi="Courier New" w:cs="Courier New"/>
-          <w:b/>
-          <w:bCs/>
-          <w:sz w:val="22"/>
-          <w:szCs w:val="22"/>
-        </w:rPr>
-      </w:pPr>
-      <w:r>
-        <w:rPr>
-          <w:rFonts w:ascii="Courier New" w:hAnsi="Courier New" w:cs="Courier New"/>
-          <w:b/>
-          <w:bCs/>
-          <w:sz w:val="22"/>
-          <w:szCs w:val="22"/>
-        </w:rPr>
-        <w:t>Loopy eye to closed door transition – [23]</w:t>
-      </w:r>
-    </w:p>
-    <w:p>
-      <w:pPr>
-        <w:rPr>
-          <w:rFonts w:ascii="Courier New" w:hAnsi="Courier New" w:cs="Courier New"/>
-          <w:b/>
-          <w:bCs/>
-          <w:sz w:val="22"/>
-          <w:szCs w:val="22"/>
-        </w:rPr>
-      </w:pPr>
-      <w:r>
-        <w:rPr>
-          <w:rFonts w:ascii="Courier New" w:hAnsi="Courier New" w:cs="Courier New"/>
-          <w:b/>
-          <w:bCs/>
-          <w:sz w:val="22"/>
-          <w:szCs w:val="22"/>
-        </w:rPr>
-        <w:lastRenderedPageBreak/>
-        <w:t>Dark foggy room – [24]</w:t>
-      </w:r>
-    </w:p>
-    <w:p>
-      <w:pPr>
-        <w:rPr>
-          <w:rFonts w:ascii="Courier New" w:hAnsi="Courier New" w:cs="Courier New"/>
-          <w:b/>
-          <w:bCs/>
-          <w:sz w:val="22"/>
-          <w:szCs w:val="22"/>
-        </w:rPr>
-      </w:pPr>
-      <w:r>
-        <w:rPr>
-          <w:rFonts w:ascii="Courier New" w:hAnsi="Courier New" w:cs="Courier New"/>
-          <w:b/>
-          <w:bCs/>
-          <w:sz w:val="22"/>
-          <w:szCs w:val="22"/>
-        </w:rPr>
-        <w:t>Envelope flies out of the TV – [24]</w:t>
-      </w:r>
-    </w:p>
-    <w:p>
-      <w:pPr>
-        <w:rPr>
-          <w:rFonts w:ascii="Courier New" w:hAnsi="Courier New" w:cs="Courier New"/>
-          <w:b/>
-          <w:bCs/>
-          <w:sz w:val="22"/>
-          <w:szCs w:val="22"/>
-        </w:rPr>
-      </w:pPr>
-      <w:r>
-        <w:rPr>
-          <w:rFonts w:ascii="Courier New" w:hAnsi="Courier New" w:cs="Courier New"/>
-          <w:b/>
-          <w:bCs/>
-          <w:sz w:val="22"/>
-          <w:szCs w:val="22"/>
-        </w:rPr>
-        <w:t>Kriti and Veds face warps – [24]</w:t>
-      </w:r>
-    </w:p>
-    <w:p>
-      <w:pPr>
-        <w:rPr>
-          <w:rFonts w:ascii="Courier New" w:hAnsi="Courier New" w:cs="Courier New"/>
-          <w:b/>
-          <w:bCs/>
-          <w:sz w:val="22"/>
-          <w:szCs w:val="22"/>
-        </w:rPr>
-      </w:pPr>
-      <w:r>
-        <w:rPr>
-          <w:rFonts w:ascii="Courier New" w:hAnsi="Courier New" w:cs="Courier New"/>
-          <w:b/>
-          <w:bCs/>
-          <w:sz w:val="22"/>
-          <w:szCs w:val="22"/>
-        </w:rPr>
-        <w:t>Priest and Pyre</w:t>
-      </w:r>
-      <w:r>
-        <w:rPr>
-          <w:rFonts w:ascii="Courier New" w:hAnsi="Courier New" w:cs="Courier New"/>
-          <w:b/>
-          <w:bCs/>
-          <w:sz w:val="22"/>
-          <w:szCs w:val="22"/>
-        </w:rPr>
-        <w:t xml:space="preserve"> and Roaring flames – [2</w:t>
-      </w:r>
-      <w:r>
-        <w:rPr>
-          <w:rFonts w:ascii="Courier New" w:hAnsi="Courier New" w:cs="Courier New"/>
-          <w:b/>
-          <w:bCs/>
-          <w:sz w:val="22"/>
-          <w:szCs w:val="22"/>
-        </w:rPr>
-        <w:t>4</w:t>
+        <w:rPr>
+          <w:rFonts w:ascii="Courier New" w:hAnsi="Courier New" w:cs="Courier New"/>
+          <w:b/>
+          <w:bCs/>
+          <w:sz w:val="22"/>
+          <w:szCs w:val="22"/>
+        </w:rPr>
+      </w:pPr>
+      <w:r>
+        <w:rPr>
+          <w:rFonts w:ascii="Courier New" w:hAnsi="Courier New" w:cs="Courier New"/>
+          <w:b/>
+          <w:bCs/>
+          <w:sz w:val="22"/>
+          <w:szCs w:val="22"/>
+        </w:rPr>
+        <w:t>Dog’s Grave – [29]</w:t>
+      </w:r>
+    </w:p>
+    <w:p>
+      <w:pPr>
+        <w:rPr>
+          <w:rFonts w:ascii="Courier New" w:hAnsi="Courier New" w:cs="Courier New"/>
+          <w:b/>
+          <w:bCs/>
+          <w:sz w:val="22"/>
+          <w:szCs w:val="22"/>
+        </w:rPr>
+      </w:pPr>
+      <w:r>
+        <w:rPr>
+          <w:rFonts w:ascii="Courier New" w:hAnsi="Courier New" w:cs="Courier New"/>
+          <w:b/>
+          <w:bCs/>
+          <w:sz w:val="22"/>
+          <w:szCs w:val="22"/>
+        </w:rPr>
+        <w:t>Post Death Sounds – [29]</w:t>
+      </w:r>
+    </w:p>
+    <w:p>
+      <w:pPr>
+        <w:rPr>
+          <w:rFonts w:ascii="Courier New" w:hAnsi="Courier New" w:cs="Courier New"/>
+          <w:b/>
+          <w:bCs/>
+          <w:sz w:val="22"/>
+          <w:szCs w:val="22"/>
+        </w:rPr>
+      </w:pPr>
+      <w:r>
+        <w:rPr>
+          <w:rFonts w:ascii="Courier New" w:hAnsi="Courier New" w:cs="Courier New"/>
+          <w:b/>
+          <w:bCs/>
+          <w:sz w:val="22"/>
+          <w:szCs w:val="22"/>
+        </w:rPr>
+        <w:t xml:space="preserve">The </w:t>
+      </w:r>
+      <w:r>
+        <w:rPr>
+          <w:rFonts w:ascii="Courier New" w:hAnsi="Courier New" w:cs="Courier New"/>
+          <w:b/>
+          <w:bCs/>
+          <w:sz w:val="22"/>
+          <w:szCs w:val="22"/>
+        </w:rPr>
+        <w:t>C</w:t>
+      </w:r>
+      <w:r>
+        <w:rPr>
+          <w:rFonts w:ascii="Courier New" w:hAnsi="Courier New" w:cs="Courier New"/>
+          <w:b/>
+          <w:bCs/>
+          <w:sz w:val="22"/>
+          <w:szCs w:val="22"/>
+        </w:rPr>
+        <w:t>remation</w:t>
+      </w:r>
+      <w:r>
+        <w:rPr>
+          <w:rFonts w:ascii="Courier New" w:hAnsi="Courier New" w:cs="Courier New"/>
+          <w:b/>
+          <w:bCs/>
+          <w:sz w:val="22"/>
+          <w:szCs w:val="22"/>
+        </w:rPr>
+        <w:t xml:space="preserve"> </w:t>
+      </w:r>
+      <w:r>
+        <w:rPr>
+          <w:rFonts w:ascii="Courier New" w:hAnsi="Courier New" w:cs="Courier New"/>
+          <w:b/>
+          <w:bCs/>
+          <w:sz w:val="22"/>
+          <w:szCs w:val="22"/>
+        </w:rPr>
+        <w:t>– [2</w:t>
+      </w:r>
+      <w:r>
+        <w:rPr>
+          <w:rFonts w:ascii="Courier New" w:hAnsi="Courier New" w:cs="Courier New"/>
+          <w:b/>
+          <w:bCs/>
+          <w:sz w:val="22"/>
+          <w:szCs w:val="22"/>
+        </w:rPr>
+        <w:t>9</w:t>
       </w:r>
       <w:r>
         <w:rPr>
@@ -3282,58 +3790,38 @@
           <w:sz w:val="22"/>
           <w:szCs w:val="22"/>
         </w:rPr>
-        <w:t>A glowing door – [24]</w:t>
-      </w:r>
-    </w:p>
-    <w:p>
-      <w:pPr>
-        <w:rPr>
-          <w:rFonts w:ascii="Courier New" w:hAnsi="Courier New" w:cs="Courier New"/>
-          <w:b/>
-          <w:bCs/>
-          <w:sz w:val="22"/>
-          <w:szCs w:val="22"/>
-        </w:rPr>
-      </w:pPr>
-      <w:r>
-        <w:rPr>
-          <w:rFonts w:ascii="Courier New" w:hAnsi="Courier New" w:cs="Courier New"/>
-          <w:b/>
-          <w:bCs/>
-          <w:sz w:val="22"/>
-          <w:szCs w:val="22"/>
-        </w:rPr>
-        <w:t xml:space="preserve">The Red Field </w:t>
-      </w:r>
-      <w:r>
-        <w:rPr>
-          <w:rFonts w:ascii="Courier New" w:hAnsi="Courier New" w:cs="Courier New"/>
-          <w:b/>
-          <w:bCs/>
-          <w:sz w:val="22"/>
-          <w:szCs w:val="22"/>
-        </w:rPr>
-        <w:t xml:space="preserve">with clouds and thunder </w:t>
-      </w:r>
-      <w:r>
-        <w:rPr>
-          <w:rFonts w:ascii="Courier New" w:hAnsi="Courier New" w:cs="Courier New"/>
-          <w:b/>
-          <w:bCs/>
-          <w:sz w:val="22"/>
-          <w:szCs w:val="22"/>
-        </w:rPr>
-        <w:t>– [2</w:t>
-      </w:r>
-      <w:r>
-        <w:rPr>
-          <w:rFonts w:ascii="Courier New" w:hAnsi="Courier New" w:cs="Courier New"/>
-          <w:b/>
-          <w:bCs/>
-          <w:sz w:val="22"/>
-          <w:szCs w:val="22"/>
-        </w:rPr>
-        <w:t>5</w:t>
+        <w:t>Morphing of Mother, Kriti and Ved in fog – [30]</w:t>
+      </w:r>
+    </w:p>
+    <w:p>
+      <w:pPr>
+        <w:rPr>
+          <w:rFonts w:ascii="Courier New" w:hAnsi="Courier New" w:cs="Courier New"/>
+          <w:b/>
+          <w:bCs/>
+          <w:sz w:val="22"/>
+          <w:szCs w:val="22"/>
+        </w:rPr>
+      </w:pPr>
+      <w:r>
+        <w:rPr>
+          <w:rFonts w:ascii="Courier New" w:hAnsi="Courier New" w:cs="Courier New"/>
+          <w:b/>
+          <w:bCs/>
+          <w:sz w:val="22"/>
+          <w:szCs w:val="22"/>
+        </w:rPr>
+        <w:t>Mother transforms into Yamadhootha – [</w:t>
+      </w:r>
+      <w:r>
+        <w:rPr>
+          <w:rFonts w:ascii="Courier New" w:hAnsi="Courier New" w:cs="Courier New"/>
+          <w:b/>
+          <w:bCs/>
+          <w:sz w:val="22"/>
+          <w:szCs w:val="22"/>
+        </w:rPr>
+        <w:t>30</w:t>
       </w:r>
       <w:r>
         <w:rPr>
@@ -3364,27 +3852,47 @@
           <w:sz w:val="22"/>
           <w:szCs w:val="22"/>
         </w:rPr>
-        <w:t>The Flying</w:t>
-      </w:r>
-      <w:r>
-        <w:rPr>
-          <w:rFonts w:ascii="Courier New" w:hAnsi="Courier New" w:cs="Courier New"/>
-          <w:b/>
-          <w:bCs/>
-          <w:sz w:val="22"/>
-          <w:szCs w:val="22"/>
-        </w:rPr>
-        <w:t xml:space="preserve"> hands of the Ghosts – [2</w:t>
-      </w:r>
-      <w:r>
-        <w:rPr>
-          <w:rFonts w:ascii="Courier New" w:hAnsi="Courier New" w:cs="Courier New"/>
-          <w:b/>
-          <w:bCs/>
-          <w:sz w:val="22"/>
-          <w:szCs w:val="22"/>
-        </w:rPr>
-        <w:t>5</w:t>
+        <w:t xml:space="preserve">Yamadhootha’s </w:t>
+      </w:r>
+      <w:r>
+        <w:rPr>
+          <w:rFonts w:ascii="Courier New" w:hAnsi="Courier New" w:cs="Courier New"/>
+          <w:b/>
+          <w:bCs/>
+          <w:sz w:val="22"/>
+          <w:szCs w:val="22"/>
+        </w:rPr>
+        <w:t>yellow-</w:t>
+      </w:r>
+      <w:r>
+        <w:rPr>
+          <w:rFonts w:ascii="Courier New" w:hAnsi="Courier New" w:cs="Courier New"/>
+          <w:b/>
+          <w:bCs/>
+          <w:sz w:val="22"/>
+          <w:szCs w:val="22"/>
+        </w:rPr>
+        <w:t xml:space="preserve">red </w:t>
+      </w:r>
+      <w:r>
+        <w:rPr>
+          <w:rFonts w:ascii="Courier New" w:hAnsi="Courier New" w:cs="Courier New"/>
+          <w:b/>
+          <w:bCs/>
+          <w:sz w:val="22"/>
+          <w:szCs w:val="22"/>
+        </w:rPr>
+        <w:t>glowing eyes – [</w:t>
+      </w:r>
+      <w:r>
+        <w:rPr>
+          <w:rFonts w:ascii="Courier New" w:hAnsi="Courier New" w:cs="Courier New"/>
+          <w:b/>
+          <w:bCs/>
+          <w:sz w:val="22"/>
+          <w:szCs w:val="22"/>
+        </w:rPr>
+        <w:t>30</w:t>
       </w:r>
       <w:r>
         <w:rPr>
@@ -3415,38 +3923,57 @@
           <w:sz w:val="22"/>
           <w:szCs w:val="22"/>
         </w:rPr>
-        <w:t>Ghost hands grip his face – [25]</w:t>
-      </w:r>
-    </w:p>
-    <w:p>
-      <w:pPr>
-        <w:rPr>
-          <w:rFonts w:ascii="Courier New" w:hAnsi="Courier New" w:cs="Courier New"/>
-          <w:b/>
-          <w:bCs/>
-          <w:sz w:val="22"/>
-          <w:szCs w:val="22"/>
-        </w:rPr>
-      </w:pPr>
-      <w:r>
-        <w:rPr>
-          <w:rFonts w:ascii="Courier New" w:hAnsi="Courier New" w:cs="Courier New"/>
-          <w:b/>
-          <w:bCs/>
-          <w:sz w:val="22"/>
-          <w:szCs w:val="22"/>
-        </w:rPr>
-        <w:t>The Red Sky with 2 Suns and Vortex – [2</w:t>
-      </w:r>
-      <w:r>
-        <w:rPr>
-          <w:rFonts w:ascii="Courier New" w:hAnsi="Courier New" w:cs="Courier New"/>
-          <w:b/>
-          <w:bCs/>
-          <w:sz w:val="22"/>
-          <w:szCs w:val="22"/>
-        </w:rPr>
-        <w:t>5</w:t>
+        <w:t xml:space="preserve">Portal </w:t>
+      </w:r>
+      <w:r>
+        <w:rPr>
+          <w:rFonts w:ascii="Courier New" w:hAnsi="Courier New" w:cs="Courier New"/>
+          <w:b/>
+          <w:bCs/>
+          <w:sz w:val="22"/>
+          <w:szCs w:val="22"/>
+        </w:rPr>
+        <w:t>Appears</w:t>
+      </w:r>
+      <w:r>
+        <w:rPr>
+          <w:rFonts w:ascii="Courier New" w:hAnsi="Courier New" w:cs="Courier New"/>
+          <w:b/>
+          <w:bCs/>
+          <w:sz w:val="22"/>
+          <w:szCs w:val="22"/>
+        </w:rPr>
+        <w:t xml:space="preserve"> through the fog</w:t>
+      </w:r>
+      <w:r>
+        <w:rPr>
+          <w:rFonts w:ascii="Courier New" w:hAnsi="Courier New" w:cs="Courier New"/>
+          <w:b/>
+          <w:bCs/>
+          <w:sz w:val="22"/>
+          <w:szCs w:val="22"/>
+        </w:rPr>
+        <w:t xml:space="preserve"> </w:t>
+      </w:r>
+      <w:r>
+        <w:rPr>
+          <w:rFonts w:ascii="Courier New" w:hAnsi="Courier New" w:cs="Courier New"/>
+          <w:b/>
+          <w:bCs/>
+          <w:sz w:val="22"/>
+          <w:szCs w:val="22"/>
+        </w:rPr>
+        <w:t>– [</w:t>
+      </w:r>
+      <w:r>
+        <w:rPr>
+          <w:rFonts w:ascii="Courier New" w:hAnsi="Courier New" w:cs="Courier New"/>
+          <w:b/>
+          <w:bCs/>
+          <w:sz w:val="22"/>
+          <w:szCs w:val="22"/>
+        </w:rPr>
+        <w:t>30</w:t>
       </w:r>
       <w:r>
         <w:rPr>
@@ -3477,17 +4004,68 @@
           <w:sz w:val="22"/>
           <w:szCs w:val="22"/>
         </w:rPr>
-        <w:t>Hit face to tree and fall – [2</w:t>
-      </w:r>
-      <w:r>
-        <w:rPr>
-          <w:rFonts w:ascii="Courier New" w:hAnsi="Courier New" w:cs="Courier New"/>
-          <w:b/>
-          <w:bCs/>
-          <w:sz w:val="22"/>
-          <w:szCs w:val="22"/>
-        </w:rPr>
-        <w:t>5</w:t>
+        <w:t>Inside portal -&gt; Photo on the other side – [30]</w:t>
+      </w:r>
+    </w:p>
+    <w:p>
+      <w:pPr>
+        <w:rPr>
+          <w:rFonts w:ascii="Courier New" w:hAnsi="Courier New" w:cs="Courier New"/>
+          <w:b/>
+          <w:bCs/>
+          <w:sz w:val="22"/>
+          <w:szCs w:val="22"/>
+        </w:rPr>
+      </w:pPr>
+      <w:r>
+        <w:rPr>
+          <w:rFonts w:ascii="Courier New" w:hAnsi="Courier New" w:cs="Courier New"/>
+          <w:b/>
+          <w:bCs/>
+          <w:sz w:val="22"/>
+          <w:szCs w:val="22"/>
+        </w:rPr>
+        <w:t xml:space="preserve">The </w:t>
+      </w:r>
+      <w:r>
+        <w:rPr>
+          <w:rFonts w:ascii="Courier New" w:hAnsi="Courier New" w:cs="Courier New"/>
+          <w:b/>
+          <w:bCs/>
+          <w:sz w:val="22"/>
+          <w:szCs w:val="22"/>
+        </w:rPr>
+        <w:t>c</w:t>
+      </w:r>
+      <w:r>
+        <w:rPr>
+          <w:rFonts w:ascii="Courier New" w:hAnsi="Courier New" w:cs="Courier New"/>
+          <w:b/>
+          <w:bCs/>
+          <w:sz w:val="22"/>
+          <w:szCs w:val="22"/>
+        </w:rPr>
+        <w:t xml:space="preserve">hain </w:t>
+      </w:r>
+      <w:r>
+        <w:rPr>
+          <w:rFonts w:ascii="Courier New" w:hAnsi="Courier New" w:cs="Courier New"/>
+          <w:b/>
+          <w:bCs/>
+          <w:sz w:val="22"/>
+          <w:szCs w:val="22"/>
+        </w:rPr>
+        <w:t>comes out of hands – [</w:t>
+      </w:r>
+      <w:r>
+        <w:rPr>
+          <w:rFonts w:ascii="Courier New" w:hAnsi="Courier New" w:cs="Courier New"/>
+          <w:b/>
+          <w:bCs/>
+          <w:sz w:val="22"/>
+          <w:szCs w:val="22"/>
+        </w:rPr>
+        <w:t>30</w:t>
       </w:r>
       <w:r>
         <w:rPr>
@@ -3518,27 +4096,17 @@
           <w:sz w:val="22"/>
           <w:szCs w:val="22"/>
         </w:rPr>
-        <w:t>Ghostly silhouettes</w:t>
-      </w:r>
-      <w:r>
-        <w:rPr>
-          <w:rFonts w:ascii="Courier New" w:hAnsi="Courier New" w:cs="Courier New"/>
-          <w:b/>
-          <w:bCs/>
-          <w:sz w:val="22"/>
-          <w:szCs w:val="22"/>
-        </w:rPr>
-        <w:t xml:space="preserve"> in the distance – [2</w:t>
-      </w:r>
-      <w:r>
-        <w:rPr>
-          <w:rFonts w:ascii="Courier New" w:hAnsi="Courier New" w:cs="Courier New"/>
-          <w:b/>
-          <w:bCs/>
-          <w:sz w:val="22"/>
-          <w:szCs w:val="22"/>
-        </w:rPr>
-        <w:t>5</w:t>
+        <w:t>The chain crawls on the floor – [</w:t>
+      </w:r>
+      <w:r>
+        <w:rPr>
+          <w:rFonts w:ascii="Courier New" w:hAnsi="Courier New" w:cs="Courier New"/>
+          <w:b/>
+          <w:bCs/>
+          <w:sz w:val="22"/>
+          <w:szCs w:val="22"/>
+        </w:rPr>
+        <w:t>30</w:t>
       </w:r>
       <w:r>
         <w:rPr>
@@ -3569,38 +4137,47 @@
           <w:sz w:val="22"/>
           <w:szCs w:val="22"/>
         </w:rPr>
-        <w:t>Appearance of Adi’s father’s ghost – [25]</w:t>
-      </w:r>
-    </w:p>
-    <w:p>
-      <w:pPr>
-        <w:rPr>
-          <w:rFonts w:ascii="Courier New" w:hAnsi="Courier New" w:cs="Courier New"/>
-          <w:b/>
-          <w:bCs/>
-          <w:sz w:val="22"/>
-          <w:szCs w:val="22"/>
-        </w:rPr>
-      </w:pPr>
-      <w:r>
-        <w:rPr>
-          <w:rFonts w:ascii="Courier New" w:hAnsi="Courier New" w:cs="Courier New"/>
-          <w:b/>
-          <w:bCs/>
-          <w:sz w:val="22"/>
-          <w:szCs w:val="22"/>
-        </w:rPr>
-        <w:t>Raven flies and sits in the tree – [2</w:t>
-      </w:r>
-      <w:r>
-        <w:rPr>
-          <w:rFonts w:ascii="Courier New" w:hAnsi="Courier New" w:cs="Courier New"/>
-          <w:b/>
-          <w:bCs/>
-          <w:sz w:val="22"/>
-          <w:szCs w:val="22"/>
-        </w:rPr>
-        <w:t>5</w:t>
+        <w:t>The chain w</w:t>
+      </w:r>
+      <w:r>
+        <w:rPr>
+          <w:rFonts w:ascii="Courier New" w:hAnsi="Courier New" w:cs="Courier New"/>
+          <w:b/>
+          <w:bCs/>
+          <w:sz w:val="22"/>
+          <w:szCs w:val="22"/>
+        </w:rPr>
+        <w:t xml:space="preserve">raps </w:t>
+      </w:r>
+      <w:r>
+        <w:rPr>
+          <w:rFonts w:ascii="Courier New" w:hAnsi="Courier New" w:cs="Courier New"/>
+          <w:b/>
+          <w:bCs/>
+          <w:sz w:val="22"/>
+          <w:szCs w:val="22"/>
+        </w:rPr>
+        <w:t xml:space="preserve">around Adi </w:t>
+      </w:r>
+      <w:r>
+        <w:rPr>
+          <w:rFonts w:ascii="Courier New" w:hAnsi="Courier New" w:cs="Courier New"/>
+          <w:b/>
+          <w:bCs/>
+          <w:sz w:val="22"/>
+          <w:szCs w:val="22"/>
+        </w:rPr>
+        <w:t>– [</w:t>
+      </w:r>
+      <w:r>
+        <w:rPr>
+          <w:rFonts w:ascii="Courier New" w:hAnsi="Courier New" w:cs="Courier New"/>
+          <w:b/>
+          <w:bCs/>
+          <w:sz w:val="22"/>
+          <w:szCs w:val="22"/>
+        </w:rPr>
+        <w:t>30</w:t>
       </w:r>
       <w:r>
         <w:rPr>
@@ -3631,864 +4208,7 @@
           <w:sz w:val="22"/>
           <w:szCs w:val="22"/>
         </w:rPr>
-        <w:t>Sesame appears on his face – [2</w:t>
-      </w:r>
-      <w:r>
-        <w:rPr>
-          <w:rFonts w:ascii="Courier New" w:hAnsi="Courier New" w:cs="Courier New"/>
-          <w:b/>
-          <w:bCs/>
-          <w:sz w:val="22"/>
-          <w:szCs w:val="22"/>
-        </w:rPr>
-        <w:t>5</w:t>
-      </w:r>
-      <w:r>
-        <w:rPr>
-          <w:rFonts w:ascii="Courier New" w:hAnsi="Courier New" w:cs="Courier New"/>
-          <w:b/>
-          <w:bCs/>
-          <w:sz w:val="22"/>
-          <w:szCs w:val="22"/>
-        </w:rPr>
-        <w:t>]</w:t>
-      </w:r>
-    </w:p>
-    <w:p>
-      <w:pPr>
-        <w:rPr>
-          <w:rFonts w:ascii="Courier New" w:hAnsi="Courier New" w:cs="Courier New"/>
-          <w:b/>
-          <w:bCs/>
-          <w:sz w:val="22"/>
-          <w:szCs w:val="22"/>
-        </w:rPr>
-      </w:pPr>
-      <w:r>
-        <w:rPr>
-          <w:rFonts w:ascii="Courier New" w:hAnsi="Courier New" w:cs="Courier New"/>
-          <w:b/>
-          <w:bCs/>
-          <w:sz w:val="22"/>
-          <w:szCs w:val="22"/>
-        </w:rPr>
-        <w:t>Raven eats sesame – [2</w:t>
-      </w:r>
-      <w:r>
-        <w:rPr>
-          <w:rFonts w:ascii="Courier New" w:hAnsi="Courier New" w:cs="Courier New"/>
-          <w:b/>
-          <w:bCs/>
-          <w:sz w:val="22"/>
-          <w:szCs w:val="22"/>
-        </w:rPr>
-        <w:t>5</w:t>
-      </w:r>
-      <w:r>
-        <w:rPr>
-          <w:rFonts w:ascii="Courier New" w:hAnsi="Courier New" w:cs="Courier New"/>
-          <w:b/>
-          <w:bCs/>
-          <w:sz w:val="22"/>
-          <w:szCs w:val="22"/>
-        </w:rPr>
-        <w:t>]</w:t>
-      </w:r>
-    </w:p>
-    <w:p>
-      <w:pPr>
-        <w:rPr>
-          <w:rFonts w:ascii="Courier New" w:hAnsi="Courier New" w:cs="Courier New"/>
-          <w:b/>
-          <w:bCs/>
-          <w:sz w:val="22"/>
-          <w:szCs w:val="22"/>
-        </w:rPr>
-      </w:pPr>
-      <w:r>
-        <w:rPr>
-          <w:rFonts w:ascii="Courier New" w:hAnsi="Courier New" w:cs="Courier New"/>
-          <w:b/>
-          <w:bCs/>
-          <w:sz w:val="22"/>
-          <w:szCs w:val="22"/>
-        </w:rPr>
-        <w:t>Vasu shots – [2</w:t>
-      </w:r>
-      <w:r>
-        <w:rPr>
-          <w:rFonts w:ascii="Courier New" w:hAnsi="Courier New" w:cs="Courier New"/>
-          <w:b/>
-          <w:bCs/>
-          <w:sz w:val="22"/>
-          <w:szCs w:val="22"/>
-        </w:rPr>
-        <w:t>5</w:t>
-      </w:r>
-      <w:r>
-        <w:rPr>
-          <w:rFonts w:ascii="Courier New" w:hAnsi="Courier New" w:cs="Courier New"/>
-          <w:b/>
-          <w:bCs/>
-          <w:sz w:val="22"/>
-          <w:szCs w:val="22"/>
-        </w:rPr>
-        <w:t>]</w:t>
-      </w:r>
-    </w:p>
-    <w:p>
-      <w:pPr>
-        <w:rPr>
-          <w:rFonts w:ascii="Courier New" w:hAnsi="Courier New" w:cs="Courier New"/>
-          <w:b/>
-          <w:bCs/>
-          <w:sz w:val="22"/>
-          <w:szCs w:val="22"/>
-        </w:rPr>
-      </w:pPr>
-      <w:r>
-        <w:rPr>
-          <w:rFonts w:ascii="Courier New" w:hAnsi="Courier New" w:cs="Courier New"/>
-          <w:b/>
-          <w:bCs/>
-          <w:sz w:val="22"/>
-          <w:szCs w:val="22"/>
-        </w:rPr>
-        <w:t xml:space="preserve">The </w:t>
-      </w:r>
-      <w:r>
-        <w:rPr>
-          <w:rFonts w:ascii="Courier New" w:hAnsi="Courier New" w:cs="Courier New"/>
-          <w:b/>
-          <w:bCs/>
-          <w:sz w:val="22"/>
-          <w:szCs w:val="22"/>
-        </w:rPr>
-        <w:t>three P</w:t>
-      </w:r>
-      <w:r>
-        <w:rPr>
-          <w:rFonts w:ascii="Courier New" w:hAnsi="Courier New" w:cs="Courier New"/>
-          <w:b/>
-          <w:bCs/>
-          <w:sz w:val="22"/>
-          <w:szCs w:val="22"/>
-        </w:rPr>
-        <w:t>itrus – [25]</w:t>
-      </w:r>
-    </w:p>
-    <w:p>
-      <w:pPr>
-        <w:rPr>
-          <w:rFonts w:ascii="Courier New" w:hAnsi="Courier New" w:cs="Courier New"/>
-          <w:b/>
-          <w:bCs/>
-          <w:sz w:val="22"/>
-          <w:szCs w:val="22"/>
-        </w:rPr>
-      </w:pPr>
-      <w:r>
-        <w:rPr>
-          <w:rFonts w:ascii="Courier New" w:hAnsi="Courier New" w:cs="Courier New"/>
-          <w:b/>
-          <w:bCs/>
-          <w:sz w:val="22"/>
-          <w:szCs w:val="22"/>
-        </w:rPr>
-        <w:t>Father opens a portal</w:t>
-      </w:r>
-      <w:r>
-        <w:rPr>
-          <w:rFonts w:ascii="Courier New" w:hAnsi="Courier New" w:cs="Courier New"/>
-          <w:b/>
-          <w:bCs/>
-          <w:sz w:val="22"/>
-          <w:szCs w:val="22"/>
-        </w:rPr>
-        <w:t xml:space="preserve"> – [2</w:t>
-      </w:r>
-      <w:r>
-        <w:rPr>
-          <w:rFonts w:ascii="Courier New" w:hAnsi="Courier New" w:cs="Courier New"/>
-          <w:b/>
-          <w:bCs/>
-          <w:sz w:val="22"/>
-          <w:szCs w:val="22"/>
-        </w:rPr>
-        <w:t>5</w:t>
-      </w:r>
-      <w:r>
-        <w:rPr>
-          <w:rFonts w:ascii="Courier New" w:hAnsi="Courier New" w:cs="Courier New"/>
-          <w:b/>
-          <w:bCs/>
-          <w:sz w:val="22"/>
-          <w:szCs w:val="22"/>
-        </w:rPr>
-        <w:t>]</w:t>
-      </w:r>
-    </w:p>
-    <w:p>
-      <w:pPr>
-        <w:rPr>
-          <w:rFonts w:ascii="Courier New" w:hAnsi="Courier New" w:cs="Courier New"/>
-          <w:b/>
-          <w:bCs/>
-          <w:sz w:val="22"/>
-          <w:szCs w:val="22"/>
-        </w:rPr>
-      </w:pPr>
-      <w:r>
-        <w:rPr>
-          <w:rFonts w:ascii="Courier New" w:hAnsi="Courier New" w:cs="Courier New"/>
-          <w:b/>
-          <w:bCs/>
-          <w:sz w:val="22"/>
-          <w:szCs w:val="22"/>
-        </w:rPr>
-        <w:t>Portal drifts away – [2</w:t>
-      </w:r>
-      <w:r>
-        <w:rPr>
-          <w:rFonts w:ascii="Courier New" w:hAnsi="Courier New" w:cs="Courier New"/>
-          <w:b/>
-          <w:bCs/>
-          <w:sz w:val="22"/>
-          <w:szCs w:val="22"/>
-        </w:rPr>
-        <w:t>6</w:t>
-      </w:r>
-      <w:r>
-        <w:rPr>
-          <w:rFonts w:ascii="Courier New" w:hAnsi="Courier New" w:cs="Courier New"/>
-          <w:b/>
-          <w:bCs/>
-          <w:sz w:val="22"/>
-          <w:szCs w:val="22"/>
-        </w:rPr>
-        <w:t>]</w:t>
-      </w:r>
-    </w:p>
-    <w:p>
-      <w:pPr>
-        <w:rPr>
-          <w:rFonts w:ascii="Courier New" w:hAnsi="Courier New" w:cs="Courier New"/>
-          <w:b/>
-          <w:bCs/>
-          <w:sz w:val="22"/>
-          <w:szCs w:val="22"/>
-        </w:rPr>
-      </w:pPr>
-      <w:r>
-        <w:rPr>
-          <w:rFonts w:ascii="Courier New" w:hAnsi="Courier New" w:cs="Courier New"/>
-          <w:b/>
-          <w:bCs/>
-          <w:sz w:val="22"/>
-          <w:szCs w:val="22"/>
-        </w:rPr>
-        <w:t>Mirror Delay – [2</w:t>
-      </w:r>
-      <w:r>
-        <w:rPr>
-          <w:rFonts w:ascii="Courier New" w:hAnsi="Courier New" w:cs="Courier New"/>
-          <w:b/>
-          <w:bCs/>
-          <w:sz w:val="22"/>
-          <w:szCs w:val="22"/>
-        </w:rPr>
-        <w:t>7</w:t>
-      </w:r>
-      <w:r>
-        <w:rPr>
-          <w:rFonts w:ascii="Courier New" w:hAnsi="Courier New" w:cs="Courier New"/>
-          <w:b/>
-          <w:bCs/>
-          <w:sz w:val="22"/>
-          <w:szCs w:val="22"/>
-        </w:rPr>
-        <w:t>]</w:t>
-      </w:r>
-    </w:p>
-    <w:p>
-      <w:pPr>
-        <w:rPr>
-          <w:rFonts w:ascii="Courier New" w:hAnsi="Courier New" w:cs="Courier New"/>
-          <w:b/>
-          <w:bCs/>
-          <w:sz w:val="22"/>
-          <w:szCs w:val="22"/>
-        </w:rPr>
-      </w:pPr>
-      <w:r>
-        <w:rPr>
-          <w:rFonts w:ascii="Courier New" w:hAnsi="Courier New" w:cs="Courier New"/>
-          <w:b/>
-          <w:bCs/>
-          <w:sz w:val="22"/>
-          <w:szCs w:val="22"/>
-        </w:rPr>
-        <w:t>Mirror explo</w:t>
-      </w:r>
-      <w:r>
-        <w:rPr>
-          <w:rFonts w:ascii="Courier New" w:hAnsi="Courier New" w:cs="Courier New"/>
-          <w:b/>
-          <w:bCs/>
-          <w:sz w:val="22"/>
-          <w:szCs w:val="22"/>
-        </w:rPr>
-        <w:t xml:space="preserve">sion and </w:t>
-      </w:r>
-      <w:r>
-        <w:rPr>
-          <w:rFonts w:ascii="Courier New" w:hAnsi="Courier New" w:cs="Courier New"/>
-          <w:b/>
-          <w:bCs/>
-          <w:sz w:val="22"/>
-          <w:szCs w:val="22"/>
-        </w:rPr>
-        <w:t xml:space="preserve">propelled </w:t>
-      </w:r>
-      <w:r>
-        <w:rPr>
-          <w:rFonts w:ascii="Courier New" w:hAnsi="Courier New" w:cs="Courier New"/>
-          <w:b/>
-          <w:bCs/>
-          <w:sz w:val="22"/>
-          <w:szCs w:val="22"/>
-        </w:rPr>
-        <w:t>back</w:t>
-      </w:r>
-      <w:r>
-        <w:rPr>
-          <w:rFonts w:ascii="Courier New" w:hAnsi="Courier New" w:cs="Courier New"/>
-          <w:b/>
-          <w:bCs/>
-          <w:sz w:val="22"/>
-          <w:szCs w:val="22"/>
-        </w:rPr>
-        <w:t>ward</w:t>
-      </w:r>
-      <w:r>
-        <w:rPr>
-          <w:rFonts w:ascii="Courier New" w:hAnsi="Courier New" w:cs="Courier New"/>
-          <w:b/>
-          <w:bCs/>
-          <w:sz w:val="22"/>
-          <w:szCs w:val="22"/>
-        </w:rPr>
-        <w:t xml:space="preserve"> </w:t>
-      </w:r>
-      <w:r>
-        <w:rPr>
-          <w:rFonts w:ascii="Courier New" w:hAnsi="Courier New" w:cs="Courier New"/>
-          <w:b/>
-          <w:bCs/>
-          <w:sz w:val="22"/>
-          <w:szCs w:val="22"/>
-        </w:rPr>
-        <w:t>– [2</w:t>
-      </w:r>
-      <w:r>
-        <w:rPr>
-          <w:rFonts w:ascii="Courier New" w:hAnsi="Courier New" w:cs="Courier New"/>
-          <w:b/>
-          <w:bCs/>
-          <w:sz w:val="22"/>
-          <w:szCs w:val="22"/>
-        </w:rPr>
-        <w:t>7</w:t>
-      </w:r>
-      <w:r>
-        <w:rPr>
-          <w:rFonts w:ascii="Courier New" w:hAnsi="Courier New" w:cs="Courier New"/>
-          <w:b/>
-          <w:bCs/>
-          <w:sz w:val="22"/>
-          <w:szCs w:val="22"/>
-        </w:rPr>
-        <w:t>]</w:t>
-      </w:r>
-    </w:p>
-    <w:p>
-      <w:pPr>
-        <w:rPr>
-          <w:rFonts w:ascii="Courier New" w:hAnsi="Courier New" w:cs="Courier New"/>
-          <w:b/>
-          <w:bCs/>
-          <w:sz w:val="22"/>
-          <w:szCs w:val="22"/>
-        </w:rPr>
-      </w:pPr>
-      <w:r>
-        <w:rPr>
-          <w:rFonts w:ascii="Courier New" w:hAnsi="Courier New" w:cs="Courier New"/>
-          <w:b/>
-          <w:bCs/>
-          <w:sz w:val="22"/>
-          <w:szCs w:val="22"/>
-        </w:rPr>
-        <w:t xml:space="preserve">The Memory </w:t>
-      </w:r>
-      <w:r>
-        <w:rPr>
-          <w:rFonts w:ascii="Courier New" w:hAnsi="Courier New" w:cs="Courier New"/>
-          <w:b/>
-          <w:bCs/>
-          <w:sz w:val="22"/>
-          <w:szCs w:val="22"/>
-        </w:rPr>
-        <w:t>shards m</w:t>
-      </w:r>
-      <w:r>
-        <w:rPr>
-          <w:rFonts w:ascii="Courier New" w:hAnsi="Courier New" w:cs="Courier New"/>
-          <w:b/>
-          <w:bCs/>
-          <w:sz w:val="22"/>
-          <w:szCs w:val="22"/>
-        </w:rPr>
-        <w:t>ontage – [2</w:t>
-      </w:r>
-      <w:r>
-        <w:rPr>
-          <w:rFonts w:ascii="Courier New" w:hAnsi="Courier New" w:cs="Courier New"/>
-          <w:b/>
-          <w:bCs/>
-          <w:sz w:val="22"/>
-          <w:szCs w:val="22"/>
-        </w:rPr>
-        <w:t>5</w:t>
-      </w:r>
-      <w:r>
-        <w:rPr>
-          <w:rFonts w:ascii="Courier New" w:hAnsi="Courier New" w:cs="Courier New"/>
-          <w:b/>
-          <w:bCs/>
-          <w:sz w:val="22"/>
-          <w:szCs w:val="22"/>
-        </w:rPr>
-        <w:t>]</w:t>
-      </w:r>
-    </w:p>
-    <w:p>
-      <w:pPr>
-        <w:rPr>
-          <w:rFonts w:ascii="Courier New" w:hAnsi="Courier New" w:cs="Courier New"/>
-          <w:b/>
-          <w:bCs/>
-          <w:sz w:val="22"/>
-          <w:szCs w:val="22"/>
-        </w:rPr>
-      </w:pPr>
-      <w:r>
-        <w:rPr>
-          <w:rFonts w:ascii="Courier New" w:hAnsi="Courier New" w:cs="Courier New"/>
-          <w:b/>
-          <w:bCs/>
-          <w:sz w:val="22"/>
-          <w:szCs w:val="22"/>
-        </w:rPr>
-        <w:t xml:space="preserve">The </w:t>
-      </w:r>
-      <w:r>
-        <w:rPr>
-          <w:rFonts w:ascii="Courier New" w:hAnsi="Courier New" w:cs="Courier New"/>
-          <w:b/>
-          <w:bCs/>
-          <w:sz w:val="22"/>
-          <w:szCs w:val="22"/>
-        </w:rPr>
-        <w:t>C</w:t>
-      </w:r>
-      <w:r>
-        <w:rPr>
-          <w:rFonts w:ascii="Courier New" w:hAnsi="Courier New" w:cs="Courier New"/>
-          <w:b/>
-          <w:bCs/>
-          <w:sz w:val="22"/>
-          <w:szCs w:val="22"/>
-        </w:rPr>
-        <w:t>remation – [2</w:t>
-      </w:r>
-      <w:r>
-        <w:rPr>
-          <w:rFonts w:ascii="Courier New" w:hAnsi="Courier New" w:cs="Courier New"/>
-          <w:b/>
-          <w:bCs/>
-          <w:sz w:val="22"/>
-          <w:szCs w:val="22"/>
-        </w:rPr>
-        <w:t>6</w:t>
-      </w:r>
-      <w:r>
-        <w:rPr>
-          <w:rFonts w:ascii="Courier New" w:hAnsi="Courier New" w:cs="Courier New"/>
-          <w:b/>
-          <w:bCs/>
-          <w:sz w:val="22"/>
-          <w:szCs w:val="22"/>
-        </w:rPr>
-        <w:t>]</w:t>
-      </w:r>
-    </w:p>
-    <w:p>
-      <w:pPr>
-        <w:rPr>
-          <w:rFonts w:ascii="Courier New" w:hAnsi="Courier New" w:cs="Courier New"/>
-          <w:b/>
-          <w:bCs/>
-          <w:sz w:val="22"/>
-          <w:szCs w:val="22"/>
-        </w:rPr>
-      </w:pPr>
-      <w:r>
-        <w:rPr>
-          <w:rFonts w:ascii="Courier New" w:hAnsi="Courier New" w:cs="Courier New"/>
-          <w:b/>
-          <w:bCs/>
-          <w:sz w:val="22"/>
-          <w:szCs w:val="22"/>
-        </w:rPr>
-        <w:t>Family appears through fog – [28]</w:t>
-      </w:r>
-    </w:p>
-    <w:p>
-      <w:pPr>
-        <w:rPr>
-          <w:rFonts w:ascii="Courier New" w:hAnsi="Courier New" w:cs="Courier New"/>
-          <w:b/>
-          <w:bCs/>
-          <w:sz w:val="22"/>
-          <w:szCs w:val="22"/>
-        </w:rPr>
-      </w:pPr>
-      <w:r>
-        <w:rPr>
-          <w:rFonts w:ascii="Courier New" w:hAnsi="Courier New" w:cs="Courier New"/>
-          <w:b/>
-          <w:bCs/>
-          <w:sz w:val="22"/>
-          <w:szCs w:val="22"/>
-        </w:rPr>
-        <w:t>Mother transforms into Yamadhootha – [28]</w:t>
-      </w:r>
-    </w:p>
-    <w:p>
-      <w:pPr>
-        <w:rPr>
-          <w:rFonts w:ascii="Courier New" w:hAnsi="Courier New" w:cs="Courier New"/>
-          <w:b/>
-          <w:bCs/>
-          <w:sz w:val="22"/>
-          <w:szCs w:val="22"/>
-        </w:rPr>
-      </w:pPr>
-      <w:r>
-        <w:rPr>
-          <w:rFonts w:ascii="Courier New" w:hAnsi="Courier New" w:cs="Courier New"/>
-          <w:b/>
-          <w:bCs/>
-          <w:sz w:val="22"/>
-          <w:szCs w:val="22"/>
-        </w:rPr>
-        <w:t xml:space="preserve">Yamadhootha’s </w:t>
-      </w:r>
-      <w:r>
-        <w:rPr>
-          <w:rFonts w:ascii="Courier New" w:hAnsi="Courier New" w:cs="Courier New"/>
-          <w:b/>
-          <w:bCs/>
-          <w:sz w:val="22"/>
-          <w:szCs w:val="22"/>
-        </w:rPr>
-        <w:t xml:space="preserve">red </w:t>
-      </w:r>
-      <w:r>
-        <w:rPr>
-          <w:rFonts w:ascii="Courier New" w:hAnsi="Courier New" w:cs="Courier New"/>
-          <w:b/>
-          <w:bCs/>
-          <w:sz w:val="22"/>
-          <w:szCs w:val="22"/>
-        </w:rPr>
-        <w:t>glowing eyes – [</w:t>
-      </w:r>
-      <w:r>
-        <w:rPr>
-          <w:rFonts w:ascii="Courier New" w:hAnsi="Courier New" w:cs="Courier New"/>
-          <w:b/>
-          <w:bCs/>
-          <w:sz w:val="22"/>
-          <w:szCs w:val="22"/>
-        </w:rPr>
-        <w:t>28</w:t>
-      </w:r>
-      <w:r>
-        <w:rPr>
-          <w:rFonts w:ascii="Courier New" w:hAnsi="Courier New" w:cs="Courier New"/>
-          <w:b/>
-          <w:bCs/>
-          <w:sz w:val="22"/>
-          <w:szCs w:val="22"/>
-        </w:rPr>
-        <w:t>]</w:t>
-      </w:r>
-    </w:p>
-    <w:p>
-      <w:pPr>
-        <w:rPr>
-          <w:rFonts w:ascii="Courier New" w:hAnsi="Courier New" w:cs="Courier New"/>
-          <w:b/>
-          <w:bCs/>
-          <w:sz w:val="22"/>
-          <w:szCs w:val="22"/>
-        </w:rPr>
-      </w:pPr>
-      <w:r>
-        <w:rPr>
-          <w:rFonts w:ascii="Courier New" w:hAnsi="Courier New" w:cs="Courier New"/>
-          <w:b/>
-          <w:bCs/>
-          <w:sz w:val="22"/>
-          <w:szCs w:val="22"/>
-        </w:rPr>
-        <w:t xml:space="preserve">Portal </w:t>
-      </w:r>
-      <w:r>
-        <w:rPr>
-          <w:rFonts w:ascii="Courier New" w:hAnsi="Courier New" w:cs="Courier New"/>
-          <w:b/>
-          <w:bCs/>
-          <w:sz w:val="22"/>
-          <w:szCs w:val="22"/>
-        </w:rPr>
-        <w:t>Appears</w:t>
-      </w:r>
-      <w:r>
-        <w:rPr>
-          <w:rFonts w:ascii="Courier New" w:hAnsi="Courier New" w:cs="Courier New"/>
-          <w:b/>
-          <w:bCs/>
-          <w:sz w:val="22"/>
-          <w:szCs w:val="22"/>
-        </w:rPr>
-        <w:t xml:space="preserve"> through the fog </w:t>
-      </w:r>
-      <w:r>
-        <w:rPr>
-          <w:rFonts w:ascii="Courier New" w:hAnsi="Courier New" w:cs="Courier New"/>
-          <w:b/>
-          <w:bCs/>
-          <w:sz w:val="22"/>
-          <w:szCs w:val="22"/>
-        </w:rPr>
-        <w:t>– [2</w:t>
-      </w:r>
-      <w:r>
-        <w:rPr>
-          <w:rFonts w:ascii="Courier New" w:hAnsi="Courier New" w:cs="Courier New"/>
-          <w:b/>
-          <w:bCs/>
-          <w:sz w:val="22"/>
-          <w:szCs w:val="22"/>
-        </w:rPr>
-        <w:t>8</w:t>
-      </w:r>
-      <w:r>
-        <w:rPr>
-          <w:rFonts w:ascii="Courier New" w:hAnsi="Courier New" w:cs="Courier New"/>
-          <w:b/>
-          <w:bCs/>
-          <w:sz w:val="22"/>
-          <w:szCs w:val="22"/>
-        </w:rPr>
-        <w:t>]</w:t>
-      </w:r>
-    </w:p>
-    <w:p>
-      <w:pPr>
-        <w:rPr>
-          <w:rFonts w:ascii="Courier New" w:hAnsi="Courier New" w:cs="Courier New"/>
-          <w:b/>
-          <w:bCs/>
-          <w:sz w:val="22"/>
-          <w:szCs w:val="22"/>
-        </w:rPr>
-      </w:pPr>
-      <w:r>
-        <w:rPr>
-          <w:rFonts w:ascii="Courier New" w:hAnsi="Courier New" w:cs="Courier New"/>
-          <w:b/>
-          <w:bCs/>
-          <w:sz w:val="22"/>
-          <w:szCs w:val="22"/>
-        </w:rPr>
-        <w:t xml:space="preserve">The </w:t>
-      </w:r>
-      <w:r>
-        <w:rPr>
-          <w:rFonts w:ascii="Courier New" w:hAnsi="Courier New" w:cs="Courier New"/>
-          <w:b/>
-          <w:bCs/>
-          <w:sz w:val="22"/>
-          <w:szCs w:val="22"/>
-        </w:rPr>
-        <w:t>c</w:t>
-      </w:r>
-      <w:r>
-        <w:rPr>
-          <w:rFonts w:ascii="Courier New" w:hAnsi="Courier New" w:cs="Courier New"/>
-          <w:b/>
-          <w:bCs/>
-          <w:sz w:val="22"/>
-          <w:szCs w:val="22"/>
-        </w:rPr>
-        <w:t xml:space="preserve">hain </w:t>
-      </w:r>
-      <w:r>
-        <w:rPr>
-          <w:rFonts w:ascii="Courier New" w:hAnsi="Courier New" w:cs="Courier New"/>
-          <w:b/>
-          <w:bCs/>
-          <w:sz w:val="22"/>
-          <w:szCs w:val="22"/>
-        </w:rPr>
-        <w:t>comes out of hands – [28]</w:t>
-      </w:r>
-    </w:p>
-    <w:p>
-      <w:pPr>
-        <w:rPr>
-          <w:rFonts w:ascii="Courier New" w:hAnsi="Courier New" w:cs="Courier New"/>
-          <w:b/>
-          <w:bCs/>
-          <w:sz w:val="22"/>
-          <w:szCs w:val="22"/>
-        </w:rPr>
-      </w:pPr>
-      <w:r>
-        <w:rPr>
-          <w:rFonts w:ascii="Courier New" w:hAnsi="Courier New" w:cs="Courier New"/>
-          <w:b/>
-          <w:bCs/>
-          <w:sz w:val="22"/>
-          <w:szCs w:val="22"/>
-        </w:rPr>
-        <w:t>The chain crawls on the floor – [28]</w:t>
-      </w:r>
-    </w:p>
-    <w:p>
-      <w:pPr>
-        <w:rPr>
-          <w:rFonts w:ascii="Courier New" w:hAnsi="Courier New" w:cs="Courier New"/>
-          <w:b/>
-          <w:bCs/>
-          <w:sz w:val="22"/>
-          <w:szCs w:val="22"/>
-        </w:rPr>
-      </w:pPr>
-      <w:r>
-        <w:rPr>
-          <w:rFonts w:ascii="Courier New" w:hAnsi="Courier New" w:cs="Courier New"/>
-          <w:b/>
-          <w:bCs/>
-          <w:sz w:val="22"/>
-          <w:szCs w:val="22"/>
-        </w:rPr>
-        <w:t>The chain w</w:t>
-      </w:r>
-      <w:r>
-        <w:rPr>
-          <w:rFonts w:ascii="Courier New" w:hAnsi="Courier New" w:cs="Courier New"/>
-          <w:b/>
-          <w:bCs/>
-          <w:sz w:val="22"/>
-          <w:szCs w:val="22"/>
-        </w:rPr>
-        <w:t xml:space="preserve">raps </w:t>
-      </w:r>
-      <w:r>
-        <w:rPr>
-          <w:rFonts w:ascii="Courier New" w:hAnsi="Courier New" w:cs="Courier New"/>
-          <w:b/>
-          <w:bCs/>
-          <w:sz w:val="22"/>
-          <w:szCs w:val="22"/>
-        </w:rPr>
-        <w:t xml:space="preserve">around Adi </w:t>
-      </w:r>
-      <w:r>
-        <w:rPr>
-          <w:rFonts w:ascii="Courier New" w:hAnsi="Courier New" w:cs="Courier New"/>
-          <w:b/>
-          <w:bCs/>
-          <w:sz w:val="22"/>
-          <w:szCs w:val="22"/>
-        </w:rPr>
-        <w:t>– [2</w:t>
-      </w:r>
-      <w:r>
-        <w:rPr>
-          <w:rFonts w:ascii="Courier New" w:hAnsi="Courier New" w:cs="Courier New"/>
-          <w:b/>
-          <w:bCs/>
-          <w:sz w:val="22"/>
-          <w:szCs w:val="22"/>
-        </w:rPr>
-        <w:t>8</w:t>
-      </w:r>
-      <w:r>
-        <w:rPr>
-          <w:rFonts w:ascii="Courier New" w:hAnsi="Courier New" w:cs="Courier New"/>
-          <w:b/>
-          <w:bCs/>
-          <w:sz w:val="22"/>
-          <w:szCs w:val="22"/>
-        </w:rPr>
-        <w:t>]</w:t>
-      </w:r>
-    </w:p>
-    <w:p>
-      <w:pPr>
-        <w:rPr>
-          <w:rFonts w:ascii="Courier New" w:hAnsi="Courier New" w:cs="Courier New"/>
-          <w:b/>
-          <w:bCs/>
-          <w:sz w:val="22"/>
-          <w:szCs w:val="22"/>
-        </w:rPr>
-      </w:pPr>
-      <w:r>
-        <w:rPr>
-          <w:rFonts w:ascii="Courier New" w:hAnsi="Courier New" w:cs="Courier New"/>
-          <w:b/>
-          <w:bCs/>
-          <w:sz w:val="22"/>
-          <w:szCs w:val="22"/>
-        </w:rPr>
-        <w:t>The Final Portal Shake – [2</w:t>
-      </w:r>
-      <w:r>
-        <w:rPr>
-          <w:rFonts w:ascii="Courier New" w:hAnsi="Courier New" w:cs="Courier New"/>
-          <w:b/>
-          <w:bCs/>
-          <w:sz w:val="22"/>
-          <w:szCs w:val="22"/>
-        </w:rPr>
-        <w:t>8</w:t>
-      </w:r>
-      <w:r>
-        <w:rPr>
-          <w:rFonts w:ascii="Courier New" w:hAnsi="Courier New" w:cs="Courier New"/>
-          <w:b/>
-          <w:bCs/>
-          <w:sz w:val="22"/>
-          <w:szCs w:val="22"/>
-        </w:rPr>
-        <w:t>]</w:t>
+        <w:t>The photo shakes in real work – [30]</w:t>
       </w:r>
     </w:p>
     <w:p>
@@ -4549,17 +4269,17 @@
           <w:sz w:val="22"/>
           <w:szCs w:val="22"/>
         </w:rPr>
-        <w:t xml:space="preserve"> – [2</w:t>
-      </w:r>
-      <w:r>
-        <w:rPr>
-          <w:rFonts w:ascii="Courier New" w:hAnsi="Courier New" w:cs="Courier New"/>
-          <w:b/>
-          <w:bCs/>
-          <w:sz w:val="22"/>
-          <w:szCs w:val="22"/>
-        </w:rPr>
-        <w:t>8</w:t>
+        <w:t xml:space="preserve"> – [</w:t>
+      </w:r>
+      <w:r>
+        <w:rPr>
+          <w:rFonts w:ascii="Courier New" w:hAnsi="Courier New" w:cs="Courier New"/>
+          <w:b/>
+          <w:bCs/>
+          <w:sz w:val="22"/>
+          <w:szCs w:val="22"/>
+        </w:rPr>
+        <w:t>30</w:t>
       </w:r>
       <w:r>
         <w:rPr>

</xml_diff>